<commit_message>
v7 patch: Discussion bridge on drug-level heterogeneity
The bridge paragraph ("sharp drug-level split...") was defined in v7 generator but
its anchor match failed silently, so it never landed in the Discussion. Patched
by anchoring to the "critical test" sentence in "Comparison with traditional ML"
subsection, inserting directly after. Now positioned as a reframing paragraph
that explicitly states PathOmicDRP is scope-matched to mechanistically multi-
factorial drugs rather than a universal predictor.

Co-Authored-By: Claude Opus 4.6 (1M context) <noreply@anthropic.com>
</commit_message>
<xml_diff>
--- a/research/PathOmicDRP_Full_Manuscript_v7.docx
+++ b/research/PathOmicDRP_Full_Manuscript_v7.docx
@@ -935,6 +935,12 @@
       <w:pPr/>
       <w:r>
         <w:t>The critical test is whether models trained on imputed targets can predict real clinical outcomes. Here, the performance hierarchy inverts completely: PathOmicDRP achieved AUC = 0.944 for Doxorubicin (p = 0.0006) and 0.907 for Cyclophosphamide (p = 0.007), while ElasticNet yielded AUC = 0.608 and 0.537 for the same drugs. Moreover, PathOmicDRP’s 256-dimensional fused embeddings contained substantially more clinical information than the 13-dimensional IC₅₀ targets (clinical AUC 0.735 vs. 0.423), confirming that multi-modal cross-attention fusion acts as a representation learning framework that transcends its training signal. External validation against 51 GDSC breast cancer cell lines with experimentally measured IC₅₀ further demonstrated that learned drug relationships reflect real pharmacology (Spearman ρ = 0.670, p = 0.012). Together, these findings establish that imputed IC₅₀ accuracy is a fundamentally misleading metric for evaluating drug response models, and that cross-modal deep learning captures non-linear interactions essential for clinical prediction.</w:t>
+      </w:r>
+    </w:p>
+    <w:p>
+      <w:pPr/>
+      <w:r>
+        <w:t>The sharp drug-level split we observed in the fair PCA-256 comparison is, we believe, one of the more interesting practical observations of this study. It reframes the question from 'does multi-modal fusion improve drug-response prediction?' to 'for which drugs does multi-modal fusion improve drug-response prediction?' and supplies a testable mechanistic hypothesis — fusion wins when response determinants span modalities — that can be revisited in larger prospective cohorts. Because different datasets sample different drugs with different response-determinant structures, the apparently contradictory direction of embedding-versus-baseline advantage across drug panels (e.g. fusion superior on doxorubicin and cyclophosphamide but inferior on taxanes) is not a failure of reproducibility but an expected drug-specific phenomenon. We therefore position PathOmicDRP not as a universal drug-response predictor but as a method whose clinical utility should be matched to the mechanistic class of the drug being evaluated.</w:t>
       </w:r>
     </w:p>
     <w:p>

</xml_diff>